<commit_message>
fix(backend): reduce table border thickness and clear existing borders
- Change border thickness from 8pt to 4pt (sz=64 -> sz=32)
- Add explicit clearing of all borders before applying new ones
  to prevent double-rendering when TableGrid style already has borders
</commit_message>
<xml_diff>
--- a/backend/testdata/standard_output.docx
+++ b/backend/testdata/standard_output.docx
@@ -134,12 +134,12 @@
         <w:tc>
           <w:tcPr>
             <w:tcBorders>
-              <w:top w:val="single" w:color="000000" w:sz="64"/>
-              <w:left w:val="single" w:color="000000" w:sz="64"/>
-              <w:bottom w:val="single" w:color="000000" w:sz="64"/>
-              <w:right w:val="single" w:color="000000" w:sz="64"/>
-              <w:insideH w:val="single" w:color="000000" w:sz="64"/>
-              <w:insideV w:val="single" w:color="000000" w:sz="64"/>
+              <w:top w:val="single" w:color="000000" w:sz="32"/>
+              <w:left w:val="single" w:color="000000" w:sz="32"/>
+              <w:bottom w:val="single" w:color="000000" w:sz="32"/>
+              <w:right w:val="single" w:color="000000" w:sz="32"/>
+              <w:insideH w:val="single" w:color="000000" w:sz="32"/>
+              <w:insideV w:val="single" w:color="000000" w:sz="32"/>
             </w:tcBorders>
             <w:vAlign w:val="center"/>
           </w:tcPr>
@@ -163,12 +163,12 @@
         <w:tc>
           <w:tcPr>
             <w:tcBorders>
-              <w:top w:val="single" w:color="000000" w:sz="64"/>
-              <w:left w:val="single" w:color="000000" w:sz="64"/>
-              <w:bottom w:val="single" w:color="000000" w:sz="64"/>
-              <w:right w:val="single" w:color="000000" w:sz="64"/>
-              <w:insideH w:val="single" w:color="000000" w:sz="64"/>
-              <w:insideV w:val="single" w:color="000000" w:sz="64"/>
+              <w:top w:val="single" w:color="000000" w:sz="32"/>
+              <w:left w:val="single" w:color="000000" w:sz="32"/>
+              <w:bottom w:val="single" w:color="000000" w:sz="32"/>
+              <w:right w:val="single" w:color="000000" w:sz="32"/>
+              <w:insideH w:val="single" w:color="000000" w:sz="32"/>
+              <w:insideV w:val="single" w:color="000000" w:sz="32"/>
             </w:tcBorders>
             <w:vAlign w:val="center"/>
           </w:tcPr>
@@ -192,12 +192,12 @@
         <w:tc>
           <w:tcPr>
             <w:tcBorders>
-              <w:top w:val="single" w:color="000000" w:sz="64"/>
-              <w:left w:val="single" w:color="000000" w:sz="64"/>
-              <w:bottom w:val="single" w:color="000000" w:sz="64"/>
-              <w:right w:val="single" w:color="000000" w:sz="64"/>
-              <w:insideH w:val="single" w:color="000000" w:sz="64"/>
-              <w:insideV w:val="single" w:color="000000" w:sz="64"/>
+              <w:top w:val="single" w:color="000000" w:sz="32"/>
+              <w:left w:val="single" w:color="000000" w:sz="32"/>
+              <w:bottom w:val="single" w:color="000000" w:sz="32"/>
+              <w:right w:val="single" w:color="000000" w:sz="32"/>
+              <w:insideH w:val="single" w:color="000000" w:sz="32"/>
+              <w:insideV w:val="single" w:color="000000" w:sz="32"/>
             </w:tcBorders>
             <w:vAlign w:val="center"/>
           </w:tcPr>
@@ -226,12 +226,12 @@
         <w:tc>
           <w:tcPr>
             <w:tcBorders>
-              <w:top w:val="single" w:color="000000" w:sz="64"/>
-              <w:left w:val="single" w:color="000000" w:sz="64"/>
-              <w:bottom w:val="single" w:color="000000" w:sz="64"/>
-              <w:right w:val="single" w:color="000000" w:sz="64"/>
-              <w:insideH w:val="single" w:color="000000" w:sz="64"/>
-              <w:insideV w:val="single" w:color="000000" w:sz="64"/>
+              <w:top w:val="single" w:color="000000" w:sz="32"/>
+              <w:left w:val="single" w:color="000000" w:sz="32"/>
+              <w:bottom w:val="single" w:color="000000" w:sz="32"/>
+              <w:right w:val="single" w:color="000000" w:sz="32"/>
+              <w:insideH w:val="single" w:color="000000" w:sz="32"/>
+              <w:insideV w:val="single" w:color="000000" w:sz="32"/>
             </w:tcBorders>
             <w:vAlign w:val="center"/>
           </w:tcPr>
@@ -255,12 +255,12 @@
         <w:tc>
           <w:tcPr>
             <w:tcBorders>
-              <w:top w:val="single" w:color="000000" w:sz="64"/>
-              <w:left w:val="single" w:color="000000" w:sz="64"/>
-              <w:bottom w:val="single" w:color="000000" w:sz="64"/>
-              <w:right w:val="single" w:color="000000" w:sz="64"/>
-              <w:insideH w:val="single" w:color="000000" w:sz="64"/>
-              <w:insideV w:val="single" w:color="000000" w:sz="64"/>
+              <w:top w:val="single" w:color="000000" w:sz="32"/>
+              <w:left w:val="single" w:color="000000" w:sz="32"/>
+              <w:bottom w:val="single" w:color="000000" w:sz="32"/>
+              <w:right w:val="single" w:color="000000" w:sz="32"/>
+              <w:insideH w:val="single" w:color="000000" w:sz="32"/>
+              <w:insideV w:val="single" w:color="000000" w:sz="32"/>
             </w:tcBorders>
             <w:vAlign w:val="center"/>
           </w:tcPr>
@@ -284,12 +284,12 @@
         <w:tc>
           <w:tcPr>
             <w:tcBorders>
-              <w:top w:val="single" w:color="000000" w:sz="64"/>
-              <w:left w:val="single" w:color="000000" w:sz="64"/>
-              <w:bottom w:val="single" w:color="000000" w:sz="64"/>
-              <w:right w:val="single" w:color="000000" w:sz="64"/>
-              <w:insideH w:val="single" w:color="000000" w:sz="64"/>
-              <w:insideV w:val="single" w:color="000000" w:sz="64"/>
+              <w:top w:val="single" w:color="000000" w:sz="32"/>
+              <w:left w:val="single" w:color="000000" w:sz="32"/>
+              <w:bottom w:val="single" w:color="000000" w:sz="32"/>
+              <w:right w:val="single" w:color="000000" w:sz="32"/>
+              <w:insideH w:val="single" w:color="000000" w:sz="32"/>
+              <w:insideV w:val="single" w:color="000000" w:sz="32"/>
             </w:tcBorders>
             <w:vAlign w:val="center"/>
           </w:tcPr>
@@ -318,12 +318,12 @@
         <w:tc>
           <w:tcPr>
             <w:tcBorders>
-              <w:top w:val="single" w:color="000000" w:sz="64"/>
-              <w:left w:val="single" w:color="000000" w:sz="64"/>
-              <w:bottom w:val="single" w:color="000000" w:sz="64"/>
-              <w:right w:val="single" w:color="000000" w:sz="64"/>
-              <w:insideH w:val="single" w:color="000000" w:sz="64"/>
-              <w:insideV w:val="single" w:color="000000" w:sz="64"/>
+              <w:top w:val="single" w:color="000000" w:sz="32"/>
+              <w:left w:val="single" w:color="000000" w:sz="32"/>
+              <w:bottom w:val="single" w:color="000000" w:sz="32"/>
+              <w:right w:val="single" w:color="000000" w:sz="32"/>
+              <w:insideH w:val="single" w:color="000000" w:sz="32"/>
+              <w:insideV w:val="single" w:color="000000" w:sz="32"/>
             </w:tcBorders>
             <w:vAlign w:val="center"/>
           </w:tcPr>
@@ -347,12 +347,12 @@
         <w:tc>
           <w:tcPr>
             <w:tcBorders>
-              <w:top w:val="single" w:color="000000" w:sz="64"/>
-              <w:left w:val="single" w:color="000000" w:sz="64"/>
-              <w:bottom w:val="single" w:color="000000" w:sz="64"/>
-              <w:right w:val="single" w:color="000000" w:sz="64"/>
-              <w:insideH w:val="single" w:color="000000" w:sz="64"/>
-              <w:insideV w:val="single" w:color="000000" w:sz="64"/>
+              <w:top w:val="single" w:color="000000" w:sz="32"/>
+              <w:left w:val="single" w:color="000000" w:sz="32"/>
+              <w:bottom w:val="single" w:color="000000" w:sz="32"/>
+              <w:right w:val="single" w:color="000000" w:sz="32"/>
+              <w:insideH w:val="single" w:color="000000" w:sz="32"/>
+              <w:insideV w:val="single" w:color="000000" w:sz="32"/>
             </w:tcBorders>
             <w:vAlign w:val="center"/>
           </w:tcPr>
@@ -376,12 +376,12 @@
         <w:tc>
           <w:tcPr>
             <w:tcBorders>
-              <w:top w:val="single" w:color="000000" w:sz="64"/>
-              <w:left w:val="single" w:color="000000" w:sz="64"/>
-              <w:bottom w:val="single" w:color="000000" w:sz="64"/>
-              <w:right w:val="single" w:color="000000" w:sz="64"/>
-              <w:insideH w:val="single" w:color="000000" w:sz="64"/>
-              <w:insideV w:val="single" w:color="000000" w:sz="64"/>
+              <w:top w:val="single" w:color="000000" w:sz="32"/>
+              <w:left w:val="single" w:color="000000" w:sz="32"/>
+              <w:bottom w:val="single" w:color="000000" w:sz="32"/>
+              <w:right w:val="single" w:color="000000" w:sz="32"/>
+              <w:insideH w:val="single" w:color="000000" w:sz="32"/>
+              <w:insideV w:val="single" w:color="000000" w:sz="32"/>
             </w:tcBorders>
             <w:vAlign w:val="center"/>
           </w:tcPr>
@@ -410,12 +410,12 @@
         <w:tc>
           <w:tcPr>
             <w:tcBorders>
-              <w:top w:val="single" w:color="000000" w:sz="64"/>
-              <w:left w:val="single" w:color="000000" w:sz="64"/>
-              <w:bottom w:val="single" w:color="000000" w:sz="64"/>
-              <w:right w:val="single" w:color="000000" w:sz="64"/>
-              <w:insideH w:val="single" w:color="000000" w:sz="64"/>
-              <w:insideV w:val="single" w:color="000000" w:sz="64"/>
+              <w:top w:val="single" w:color="000000" w:sz="32"/>
+              <w:left w:val="single" w:color="000000" w:sz="32"/>
+              <w:bottom w:val="single" w:color="000000" w:sz="32"/>
+              <w:right w:val="single" w:color="000000" w:sz="32"/>
+              <w:insideH w:val="single" w:color="000000" w:sz="32"/>
+              <w:insideV w:val="single" w:color="000000" w:sz="32"/>
             </w:tcBorders>
             <w:vAlign w:val="center"/>
           </w:tcPr>
@@ -439,12 +439,12 @@
         <w:tc>
           <w:tcPr>
             <w:tcBorders>
-              <w:top w:val="single" w:color="000000" w:sz="64"/>
-              <w:left w:val="single" w:color="000000" w:sz="64"/>
-              <w:bottom w:val="single" w:color="000000" w:sz="64"/>
-              <w:right w:val="single" w:color="000000" w:sz="64"/>
-              <w:insideH w:val="single" w:color="000000" w:sz="64"/>
-              <w:insideV w:val="single" w:color="000000" w:sz="64"/>
+              <w:top w:val="single" w:color="000000" w:sz="32"/>
+              <w:left w:val="single" w:color="000000" w:sz="32"/>
+              <w:bottom w:val="single" w:color="000000" w:sz="32"/>
+              <w:right w:val="single" w:color="000000" w:sz="32"/>
+              <w:insideH w:val="single" w:color="000000" w:sz="32"/>
+              <w:insideV w:val="single" w:color="000000" w:sz="32"/>
             </w:tcBorders>
             <w:vAlign w:val="center"/>
           </w:tcPr>
@@ -468,12 +468,12 @@
         <w:tc>
           <w:tcPr>
             <w:tcBorders>
-              <w:top w:val="single" w:color="000000" w:sz="64"/>
-              <w:left w:val="single" w:color="000000" w:sz="64"/>
-              <w:bottom w:val="single" w:color="000000" w:sz="64"/>
-              <w:right w:val="single" w:color="000000" w:sz="64"/>
-              <w:insideH w:val="single" w:color="000000" w:sz="64"/>
-              <w:insideV w:val="single" w:color="000000" w:sz="64"/>
+              <w:top w:val="single" w:color="000000" w:sz="32"/>
+              <w:left w:val="single" w:color="000000" w:sz="32"/>
+              <w:bottom w:val="single" w:color="000000" w:sz="32"/>
+              <w:right w:val="single" w:color="000000" w:sz="32"/>
+              <w:insideH w:val="single" w:color="000000" w:sz="32"/>
+              <w:insideV w:val="single" w:color="000000" w:sz="32"/>
             </w:tcBorders>
             <w:vAlign w:val="center"/>
           </w:tcPr>
@@ -742,12 +742,12 @@
         <w:tc>
           <w:tcPr>
             <w:tcBorders>
-              <w:top w:val="single" w:color="000000" w:sz="64"/>
-              <w:left w:val="single" w:color="000000" w:sz="64"/>
-              <w:bottom w:val="single" w:color="000000" w:sz="64"/>
-              <w:right w:val="single" w:color="000000" w:sz="64"/>
-              <w:insideH w:val="single" w:color="000000" w:sz="64"/>
-              <w:insideV w:val="single" w:color="000000" w:sz="64"/>
+              <w:top w:val="single" w:color="000000" w:sz="32"/>
+              <w:left w:val="single" w:color="000000" w:sz="32"/>
+              <w:bottom w:val="single" w:color="000000" w:sz="32"/>
+              <w:right w:val="single" w:color="000000" w:sz="32"/>
+              <w:insideH w:val="single" w:color="000000" w:sz="32"/>
+              <w:insideV w:val="single" w:color="000000" w:sz="32"/>
             </w:tcBorders>
             <w:vAlign w:val="center"/>
           </w:tcPr>
@@ -771,12 +771,12 @@
         <w:tc>
           <w:tcPr>
             <w:tcBorders>
-              <w:top w:val="single" w:color="000000" w:sz="64"/>
-              <w:left w:val="single" w:color="000000" w:sz="64"/>
-              <w:bottom w:val="single" w:color="000000" w:sz="64"/>
-              <w:right w:val="single" w:color="000000" w:sz="64"/>
-              <w:insideH w:val="single" w:color="000000" w:sz="64"/>
-              <w:insideV w:val="single" w:color="000000" w:sz="64"/>
+              <w:top w:val="single" w:color="000000" w:sz="32"/>
+              <w:left w:val="single" w:color="000000" w:sz="32"/>
+              <w:bottom w:val="single" w:color="000000" w:sz="32"/>
+              <w:right w:val="single" w:color="000000" w:sz="32"/>
+              <w:insideH w:val="single" w:color="000000" w:sz="32"/>
+              <w:insideV w:val="single" w:color="000000" w:sz="32"/>
             </w:tcBorders>
             <w:vAlign w:val="center"/>
           </w:tcPr>
@@ -800,12 +800,12 @@
         <w:tc>
           <w:tcPr>
             <w:tcBorders>
-              <w:top w:val="single" w:color="000000" w:sz="64"/>
-              <w:left w:val="single" w:color="000000" w:sz="64"/>
-              <w:bottom w:val="single" w:color="000000" w:sz="64"/>
-              <w:right w:val="single" w:color="000000" w:sz="64"/>
-              <w:insideH w:val="single" w:color="000000" w:sz="64"/>
-              <w:insideV w:val="single" w:color="000000" w:sz="64"/>
+              <w:top w:val="single" w:color="000000" w:sz="32"/>
+              <w:left w:val="single" w:color="000000" w:sz="32"/>
+              <w:bottom w:val="single" w:color="000000" w:sz="32"/>
+              <w:right w:val="single" w:color="000000" w:sz="32"/>
+              <w:insideH w:val="single" w:color="000000" w:sz="32"/>
+              <w:insideV w:val="single" w:color="000000" w:sz="32"/>
             </w:tcBorders>
             <w:vAlign w:val="center"/>
           </w:tcPr>
@@ -829,12 +829,12 @@
         <w:tc>
           <w:tcPr>
             <w:tcBorders>
-              <w:top w:val="single" w:color="000000" w:sz="64"/>
-              <w:left w:val="single" w:color="000000" w:sz="64"/>
-              <w:bottom w:val="single" w:color="000000" w:sz="64"/>
-              <w:right w:val="single" w:color="000000" w:sz="64"/>
-              <w:insideH w:val="single" w:color="000000" w:sz="64"/>
-              <w:insideV w:val="single" w:color="000000" w:sz="64"/>
+              <w:top w:val="single" w:color="000000" w:sz="32"/>
+              <w:left w:val="single" w:color="000000" w:sz="32"/>
+              <w:bottom w:val="single" w:color="000000" w:sz="32"/>
+              <w:right w:val="single" w:color="000000" w:sz="32"/>
+              <w:insideH w:val="single" w:color="000000" w:sz="32"/>
+              <w:insideV w:val="single" w:color="000000" w:sz="32"/>
             </w:tcBorders>
             <w:vAlign w:val="center"/>
           </w:tcPr>
@@ -863,12 +863,12 @@
         <w:tc>
           <w:tcPr>
             <w:tcBorders>
-              <w:top w:val="single" w:color="000000" w:sz="64"/>
-              <w:left w:val="single" w:color="000000" w:sz="64"/>
-              <w:bottom w:val="single" w:color="000000" w:sz="64"/>
-              <w:right w:val="single" w:color="000000" w:sz="64"/>
-              <w:insideH w:val="single" w:color="000000" w:sz="64"/>
-              <w:insideV w:val="single" w:color="000000" w:sz="64"/>
+              <w:top w:val="single" w:color="000000" w:sz="32"/>
+              <w:left w:val="single" w:color="000000" w:sz="32"/>
+              <w:bottom w:val="single" w:color="000000" w:sz="32"/>
+              <w:right w:val="single" w:color="000000" w:sz="32"/>
+              <w:insideH w:val="single" w:color="000000" w:sz="32"/>
+              <w:insideV w:val="single" w:color="000000" w:sz="32"/>
             </w:tcBorders>
             <w:vAlign w:val="center"/>
           </w:tcPr>
@@ -892,12 +892,12 @@
         <w:tc>
           <w:tcPr>
             <w:tcBorders>
-              <w:top w:val="single" w:color="000000" w:sz="64"/>
-              <w:left w:val="single" w:color="000000" w:sz="64"/>
-              <w:bottom w:val="single" w:color="000000" w:sz="64"/>
-              <w:right w:val="single" w:color="000000" w:sz="64"/>
-              <w:insideH w:val="single" w:color="000000" w:sz="64"/>
-              <w:insideV w:val="single" w:color="000000" w:sz="64"/>
+              <w:top w:val="single" w:color="000000" w:sz="32"/>
+              <w:left w:val="single" w:color="000000" w:sz="32"/>
+              <w:bottom w:val="single" w:color="000000" w:sz="32"/>
+              <w:right w:val="single" w:color="000000" w:sz="32"/>
+              <w:insideH w:val="single" w:color="000000" w:sz="32"/>
+              <w:insideV w:val="single" w:color="000000" w:sz="32"/>
             </w:tcBorders>
             <w:vAlign w:val="center"/>
           </w:tcPr>
@@ -921,12 +921,12 @@
         <w:tc>
           <w:tcPr>
             <w:tcBorders>
-              <w:top w:val="single" w:color="000000" w:sz="64"/>
-              <w:left w:val="single" w:color="000000" w:sz="64"/>
-              <w:bottom w:val="single" w:color="000000" w:sz="64"/>
-              <w:right w:val="single" w:color="000000" w:sz="64"/>
-              <w:insideH w:val="single" w:color="000000" w:sz="64"/>
-              <w:insideV w:val="single" w:color="000000" w:sz="64"/>
+              <w:top w:val="single" w:color="000000" w:sz="32"/>
+              <w:left w:val="single" w:color="000000" w:sz="32"/>
+              <w:bottom w:val="single" w:color="000000" w:sz="32"/>
+              <w:right w:val="single" w:color="000000" w:sz="32"/>
+              <w:insideH w:val="single" w:color="000000" w:sz="32"/>
+              <w:insideV w:val="single" w:color="000000" w:sz="32"/>
             </w:tcBorders>
             <w:vAlign w:val="center"/>
           </w:tcPr>
@@ -950,12 +950,12 @@
         <w:tc>
           <w:tcPr>
             <w:tcBorders>
-              <w:top w:val="single" w:color="000000" w:sz="64"/>
-              <w:left w:val="single" w:color="000000" w:sz="64"/>
-              <w:bottom w:val="single" w:color="000000" w:sz="64"/>
-              <w:right w:val="single" w:color="000000" w:sz="64"/>
-              <w:insideH w:val="single" w:color="000000" w:sz="64"/>
-              <w:insideV w:val="single" w:color="000000" w:sz="64"/>
+              <w:top w:val="single" w:color="000000" w:sz="32"/>
+              <w:left w:val="single" w:color="000000" w:sz="32"/>
+              <w:bottom w:val="single" w:color="000000" w:sz="32"/>
+              <w:right w:val="single" w:color="000000" w:sz="32"/>
+              <w:insideH w:val="single" w:color="000000" w:sz="32"/>
+              <w:insideV w:val="single" w:color="000000" w:sz="32"/>
             </w:tcBorders>
             <w:vAlign w:val="center"/>
           </w:tcPr>
@@ -984,12 +984,12 @@
         <w:tc>
           <w:tcPr>
             <w:tcBorders>
-              <w:top w:val="single" w:color="000000" w:sz="64"/>
-              <w:left w:val="single" w:color="000000" w:sz="64"/>
-              <w:bottom w:val="single" w:color="000000" w:sz="64"/>
-              <w:right w:val="single" w:color="000000" w:sz="64"/>
-              <w:insideH w:val="single" w:color="000000" w:sz="64"/>
-              <w:insideV w:val="single" w:color="000000" w:sz="64"/>
+              <w:top w:val="single" w:color="000000" w:sz="32"/>
+              <w:left w:val="single" w:color="000000" w:sz="32"/>
+              <w:bottom w:val="single" w:color="000000" w:sz="32"/>
+              <w:right w:val="single" w:color="000000" w:sz="32"/>
+              <w:insideH w:val="single" w:color="000000" w:sz="32"/>
+              <w:insideV w:val="single" w:color="000000" w:sz="32"/>
             </w:tcBorders>
             <w:vAlign w:val="center"/>
           </w:tcPr>
@@ -1013,12 +1013,12 @@
         <w:tc>
           <w:tcPr>
             <w:tcBorders>
-              <w:top w:val="single" w:color="000000" w:sz="64"/>
-              <w:left w:val="single" w:color="000000" w:sz="64"/>
-              <w:bottom w:val="single" w:color="000000" w:sz="64"/>
-              <w:right w:val="single" w:color="000000" w:sz="64"/>
-              <w:insideH w:val="single" w:color="000000" w:sz="64"/>
-              <w:insideV w:val="single" w:color="000000" w:sz="64"/>
+              <w:top w:val="single" w:color="000000" w:sz="32"/>
+              <w:left w:val="single" w:color="000000" w:sz="32"/>
+              <w:bottom w:val="single" w:color="000000" w:sz="32"/>
+              <w:right w:val="single" w:color="000000" w:sz="32"/>
+              <w:insideH w:val="single" w:color="000000" w:sz="32"/>
+              <w:insideV w:val="single" w:color="000000" w:sz="32"/>
             </w:tcBorders>
             <w:vAlign w:val="center"/>
           </w:tcPr>
@@ -1042,12 +1042,12 @@
         <w:tc>
           <w:tcPr>
             <w:tcBorders>
-              <w:top w:val="single" w:color="000000" w:sz="64"/>
-              <w:left w:val="single" w:color="000000" w:sz="64"/>
-              <w:bottom w:val="single" w:color="000000" w:sz="64"/>
-              <w:right w:val="single" w:color="000000" w:sz="64"/>
-              <w:insideH w:val="single" w:color="000000" w:sz="64"/>
-              <w:insideV w:val="single" w:color="000000" w:sz="64"/>
+              <w:top w:val="single" w:color="000000" w:sz="32"/>
+              <w:left w:val="single" w:color="000000" w:sz="32"/>
+              <w:bottom w:val="single" w:color="000000" w:sz="32"/>
+              <w:right w:val="single" w:color="000000" w:sz="32"/>
+              <w:insideH w:val="single" w:color="000000" w:sz="32"/>
+              <w:insideV w:val="single" w:color="000000" w:sz="32"/>
             </w:tcBorders>
             <w:vAlign w:val="center"/>
           </w:tcPr>
@@ -1071,12 +1071,12 @@
         <w:tc>
           <w:tcPr>
             <w:tcBorders>
-              <w:top w:val="single" w:color="000000" w:sz="64"/>
-              <w:left w:val="single" w:color="000000" w:sz="64"/>
-              <w:bottom w:val="single" w:color="000000" w:sz="64"/>
-              <w:right w:val="single" w:color="000000" w:sz="64"/>
-              <w:insideH w:val="single" w:color="000000" w:sz="64"/>
-              <w:insideV w:val="single" w:color="000000" w:sz="64"/>
+              <w:top w:val="single" w:color="000000" w:sz="32"/>
+              <w:left w:val="single" w:color="000000" w:sz="32"/>
+              <w:bottom w:val="single" w:color="000000" w:sz="32"/>
+              <w:right w:val="single" w:color="000000" w:sz="32"/>
+              <w:insideH w:val="single" w:color="000000" w:sz="32"/>
+              <w:insideV w:val="single" w:color="000000" w:sz="32"/>
             </w:tcBorders>
             <w:vAlign w:val="center"/>
           </w:tcPr>

</xml_diff>

<commit_message>
fix(backend): reduce table border to 1px (sz=6)
- Change border thickness from 4pt (sz=32) to 1px (sz=6)
- Add preserve/original skip option for border styles
</commit_message>
<xml_diff>
--- a/backend/testdata/standard_output.docx
+++ b/backend/testdata/standard_output.docx
@@ -134,12 +134,12 @@
         <w:tc>
           <w:tcPr>
             <w:tcBorders>
-              <w:top w:val="single" w:color="000000" w:sz="32"/>
-              <w:left w:val="single" w:color="000000" w:sz="32"/>
-              <w:bottom w:val="single" w:color="000000" w:sz="32"/>
-              <w:right w:val="single" w:color="000000" w:sz="32"/>
-              <w:insideH w:val="single" w:color="000000" w:sz="32"/>
-              <w:insideV w:val="single" w:color="000000" w:sz="32"/>
+              <w:top w:val="single" w:color="000000" w:sz="6"/>
+              <w:left w:val="single" w:color="000000" w:sz="6"/>
+              <w:bottom w:val="single" w:color="000000" w:sz="6"/>
+              <w:right w:val="single" w:color="000000" w:sz="6"/>
+              <w:insideH w:val="single" w:color="000000" w:sz="6"/>
+              <w:insideV w:val="single" w:color="000000" w:sz="6"/>
             </w:tcBorders>
             <w:vAlign w:val="center"/>
           </w:tcPr>
@@ -163,12 +163,12 @@
         <w:tc>
           <w:tcPr>
             <w:tcBorders>
-              <w:top w:val="single" w:color="000000" w:sz="32"/>
-              <w:left w:val="single" w:color="000000" w:sz="32"/>
-              <w:bottom w:val="single" w:color="000000" w:sz="32"/>
-              <w:right w:val="single" w:color="000000" w:sz="32"/>
-              <w:insideH w:val="single" w:color="000000" w:sz="32"/>
-              <w:insideV w:val="single" w:color="000000" w:sz="32"/>
+              <w:top w:val="single" w:color="000000" w:sz="6"/>
+              <w:left w:val="single" w:color="000000" w:sz="6"/>
+              <w:bottom w:val="single" w:color="000000" w:sz="6"/>
+              <w:right w:val="single" w:color="000000" w:sz="6"/>
+              <w:insideH w:val="single" w:color="000000" w:sz="6"/>
+              <w:insideV w:val="single" w:color="000000" w:sz="6"/>
             </w:tcBorders>
             <w:vAlign w:val="center"/>
           </w:tcPr>
@@ -192,12 +192,12 @@
         <w:tc>
           <w:tcPr>
             <w:tcBorders>
-              <w:top w:val="single" w:color="000000" w:sz="32"/>
-              <w:left w:val="single" w:color="000000" w:sz="32"/>
-              <w:bottom w:val="single" w:color="000000" w:sz="32"/>
-              <w:right w:val="single" w:color="000000" w:sz="32"/>
-              <w:insideH w:val="single" w:color="000000" w:sz="32"/>
-              <w:insideV w:val="single" w:color="000000" w:sz="32"/>
+              <w:top w:val="single" w:color="000000" w:sz="6"/>
+              <w:left w:val="single" w:color="000000" w:sz="6"/>
+              <w:bottom w:val="single" w:color="000000" w:sz="6"/>
+              <w:right w:val="single" w:color="000000" w:sz="6"/>
+              <w:insideH w:val="single" w:color="000000" w:sz="6"/>
+              <w:insideV w:val="single" w:color="000000" w:sz="6"/>
             </w:tcBorders>
             <w:vAlign w:val="center"/>
           </w:tcPr>
@@ -226,12 +226,12 @@
         <w:tc>
           <w:tcPr>
             <w:tcBorders>
-              <w:top w:val="single" w:color="000000" w:sz="32"/>
-              <w:left w:val="single" w:color="000000" w:sz="32"/>
-              <w:bottom w:val="single" w:color="000000" w:sz="32"/>
-              <w:right w:val="single" w:color="000000" w:sz="32"/>
-              <w:insideH w:val="single" w:color="000000" w:sz="32"/>
-              <w:insideV w:val="single" w:color="000000" w:sz="32"/>
+              <w:top w:val="single" w:color="000000" w:sz="6"/>
+              <w:left w:val="single" w:color="000000" w:sz="6"/>
+              <w:bottom w:val="single" w:color="000000" w:sz="6"/>
+              <w:right w:val="single" w:color="000000" w:sz="6"/>
+              <w:insideH w:val="single" w:color="000000" w:sz="6"/>
+              <w:insideV w:val="single" w:color="000000" w:sz="6"/>
             </w:tcBorders>
             <w:vAlign w:val="center"/>
           </w:tcPr>
@@ -255,12 +255,12 @@
         <w:tc>
           <w:tcPr>
             <w:tcBorders>
-              <w:top w:val="single" w:color="000000" w:sz="32"/>
-              <w:left w:val="single" w:color="000000" w:sz="32"/>
-              <w:bottom w:val="single" w:color="000000" w:sz="32"/>
-              <w:right w:val="single" w:color="000000" w:sz="32"/>
-              <w:insideH w:val="single" w:color="000000" w:sz="32"/>
-              <w:insideV w:val="single" w:color="000000" w:sz="32"/>
+              <w:top w:val="single" w:color="000000" w:sz="6"/>
+              <w:left w:val="single" w:color="000000" w:sz="6"/>
+              <w:bottom w:val="single" w:color="000000" w:sz="6"/>
+              <w:right w:val="single" w:color="000000" w:sz="6"/>
+              <w:insideH w:val="single" w:color="000000" w:sz="6"/>
+              <w:insideV w:val="single" w:color="000000" w:sz="6"/>
             </w:tcBorders>
             <w:vAlign w:val="center"/>
           </w:tcPr>
@@ -284,12 +284,12 @@
         <w:tc>
           <w:tcPr>
             <w:tcBorders>
-              <w:top w:val="single" w:color="000000" w:sz="32"/>
-              <w:left w:val="single" w:color="000000" w:sz="32"/>
-              <w:bottom w:val="single" w:color="000000" w:sz="32"/>
-              <w:right w:val="single" w:color="000000" w:sz="32"/>
-              <w:insideH w:val="single" w:color="000000" w:sz="32"/>
-              <w:insideV w:val="single" w:color="000000" w:sz="32"/>
+              <w:top w:val="single" w:color="000000" w:sz="6"/>
+              <w:left w:val="single" w:color="000000" w:sz="6"/>
+              <w:bottom w:val="single" w:color="000000" w:sz="6"/>
+              <w:right w:val="single" w:color="000000" w:sz="6"/>
+              <w:insideH w:val="single" w:color="000000" w:sz="6"/>
+              <w:insideV w:val="single" w:color="000000" w:sz="6"/>
             </w:tcBorders>
             <w:vAlign w:val="center"/>
           </w:tcPr>
@@ -318,12 +318,12 @@
         <w:tc>
           <w:tcPr>
             <w:tcBorders>
-              <w:top w:val="single" w:color="000000" w:sz="32"/>
-              <w:left w:val="single" w:color="000000" w:sz="32"/>
-              <w:bottom w:val="single" w:color="000000" w:sz="32"/>
-              <w:right w:val="single" w:color="000000" w:sz="32"/>
-              <w:insideH w:val="single" w:color="000000" w:sz="32"/>
-              <w:insideV w:val="single" w:color="000000" w:sz="32"/>
+              <w:top w:val="single" w:color="000000" w:sz="6"/>
+              <w:left w:val="single" w:color="000000" w:sz="6"/>
+              <w:bottom w:val="single" w:color="000000" w:sz="6"/>
+              <w:right w:val="single" w:color="000000" w:sz="6"/>
+              <w:insideH w:val="single" w:color="000000" w:sz="6"/>
+              <w:insideV w:val="single" w:color="000000" w:sz="6"/>
             </w:tcBorders>
             <w:vAlign w:val="center"/>
           </w:tcPr>
@@ -347,12 +347,12 @@
         <w:tc>
           <w:tcPr>
             <w:tcBorders>
-              <w:top w:val="single" w:color="000000" w:sz="32"/>
-              <w:left w:val="single" w:color="000000" w:sz="32"/>
-              <w:bottom w:val="single" w:color="000000" w:sz="32"/>
-              <w:right w:val="single" w:color="000000" w:sz="32"/>
-              <w:insideH w:val="single" w:color="000000" w:sz="32"/>
-              <w:insideV w:val="single" w:color="000000" w:sz="32"/>
+              <w:top w:val="single" w:color="000000" w:sz="6"/>
+              <w:left w:val="single" w:color="000000" w:sz="6"/>
+              <w:bottom w:val="single" w:color="000000" w:sz="6"/>
+              <w:right w:val="single" w:color="000000" w:sz="6"/>
+              <w:insideH w:val="single" w:color="000000" w:sz="6"/>
+              <w:insideV w:val="single" w:color="000000" w:sz="6"/>
             </w:tcBorders>
             <w:vAlign w:val="center"/>
           </w:tcPr>
@@ -376,12 +376,12 @@
         <w:tc>
           <w:tcPr>
             <w:tcBorders>
-              <w:top w:val="single" w:color="000000" w:sz="32"/>
-              <w:left w:val="single" w:color="000000" w:sz="32"/>
-              <w:bottom w:val="single" w:color="000000" w:sz="32"/>
-              <w:right w:val="single" w:color="000000" w:sz="32"/>
-              <w:insideH w:val="single" w:color="000000" w:sz="32"/>
-              <w:insideV w:val="single" w:color="000000" w:sz="32"/>
+              <w:top w:val="single" w:color="000000" w:sz="6"/>
+              <w:left w:val="single" w:color="000000" w:sz="6"/>
+              <w:bottom w:val="single" w:color="000000" w:sz="6"/>
+              <w:right w:val="single" w:color="000000" w:sz="6"/>
+              <w:insideH w:val="single" w:color="000000" w:sz="6"/>
+              <w:insideV w:val="single" w:color="000000" w:sz="6"/>
             </w:tcBorders>
             <w:vAlign w:val="center"/>
           </w:tcPr>
@@ -410,12 +410,12 @@
         <w:tc>
           <w:tcPr>
             <w:tcBorders>
-              <w:top w:val="single" w:color="000000" w:sz="32"/>
-              <w:left w:val="single" w:color="000000" w:sz="32"/>
-              <w:bottom w:val="single" w:color="000000" w:sz="32"/>
-              <w:right w:val="single" w:color="000000" w:sz="32"/>
-              <w:insideH w:val="single" w:color="000000" w:sz="32"/>
-              <w:insideV w:val="single" w:color="000000" w:sz="32"/>
+              <w:top w:val="single" w:color="000000" w:sz="6"/>
+              <w:left w:val="single" w:color="000000" w:sz="6"/>
+              <w:bottom w:val="single" w:color="000000" w:sz="6"/>
+              <w:right w:val="single" w:color="000000" w:sz="6"/>
+              <w:insideH w:val="single" w:color="000000" w:sz="6"/>
+              <w:insideV w:val="single" w:color="000000" w:sz="6"/>
             </w:tcBorders>
             <w:vAlign w:val="center"/>
           </w:tcPr>
@@ -439,12 +439,12 @@
         <w:tc>
           <w:tcPr>
             <w:tcBorders>
-              <w:top w:val="single" w:color="000000" w:sz="32"/>
-              <w:left w:val="single" w:color="000000" w:sz="32"/>
-              <w:bottom w:val="single" w:color="000000" w:sz="32"/>
-              <w:right w:val="single" w:color="000000" w:sz="32"/>
-              <w:insideH w:val="single" w:color="000000" w:sz="32"/>
-              <w:insideV w:val="single" w:color="000000" w:sz="32"/>
+              <w:top w:val="single" w:color="000000" w:sz="6"/>
+              <w:left w:val="single" w:color="000000" w:sz="6"/>
+              <w:bottom w:val="single" w:color="000000" w:sz="6"/>
+              <w:right w:val="single" w:color="000000" w:sz="6"/>
+              <w:insideH w:val="single" w:color="000000" w:sz="6"/>
+              <w:insideV w:val="single" w:color="000000" w:sz="6"/>
             </w:tcBorders>
             <w:vAlign w:val="center"/>
           </w:tcPr>
@@ -468,12 +468,12 @@
         <w:tc>
           <w:tcPr>
             <w:tcBorders>
-              <w:top w:val="single" w:color="000000" w:sz="32"/>
-              <w:left w:val="single" w:color="000000" w:sz="32"/>
-              <w:bottom w:val="single" w:color="000000" w:sz="32"/>
-              <w:right w:val="single" w:color="000000" w:sz="32"/>
-              <w:insideH w:val="single" w:color="000000" w:sz="32"/>
-              <w:insideV w:val="single" w:color="000000" w:sz="32"/>
+              <w:top w:val="single" w:color="000000" w:sz="6"/>
+              <w:left w:val="single" w:color="000000" w:sz="6"/>
+              <w:bottom w:val="single" w:color="000000" w:sz="6"/>
+              <w:right w:val="single" w:color="000000" w:sz="6"/>
+              <w:insideH w:val="single" w:color="000000" w:sz="6"/>
+              <w:insideV w:val="single" w:color="000000" w:sz="6"/>
             </w:tcBorders>
             <w:vAlign w:val="center"/>
           </w:tcPr>
@@ -742,12 +742,12 @@
         <w:tc>
           <w:tcPr>
             <w:tcBorders>
-              <w:top w:val="single" w:color="000000" w:sz="32"/>
-              <w:left w:val="single" w:color="000000" w:sz="32"/>
-              <w:bottom w:val="single" w:color="000000" w:sz="32"/>
-              <w:right w:val="single" w:color="000000" w:sz="32"/>
-              <w:insideH w:val="single" w:color="000000" w:sz="32"/>
-              <w:insideV w:val="single" w:color="000000" w:sz="32"/>
+              <w:top w:val="single" w:color="000000" w:sz="6"/>
+              <w:left w:val="single" w:color="000000" w:sz="6"/>
+              <w:bottom w:val="single" w:color="000000" w:sz="6"/>
+              <w:right w:val="single" w:color="000000" w:sz="6"/>
+              <w:insideH w:val="single" w:color="000000" w:sz="6"/>
+              <w:insideV w:val="single" w:color="000000" w:sz="6"/>
             </w:tcBorders>
             <w:vAlign w:val="center"/>
           </w:tcPr>
@@ -771,12 +771,12 @@
         <w:tc>
           <w:tcPr>
             <w:tcBorders>
-              <w:top w:val="single" w:color="000000" w:sz="32"/>
-              <w:left w:val="single" w:color="000000" w:sz="32"/>
-              <w:bottom w:val="single" w:color="000000" w:sz="32"/>
-              <w:right w:val="single" w:color="000000" w:sz="32"/>
-              <w:insideH w:val="single" w:color="000000" w:sz="32"/>
-              <w:insideV w:val="single" w:color="000000" w:sz="32"/>
+              <w:top w:val="single" w:color="000000" w:sz="6"/>
+              <w:left w:val="single" w:color="000000" w:sz="6"/>
+              <w:bottom w:val="single" w:color="000000" w:sz="6"/>
+              <w:right w:val="single" w:color="000000" w:sz="6"/>
+              <w:insideH w:val="single" w:color="000000" w:sz="6"/>
+              <w:insideV w:val="single" w:color="000000" w:sz="6"/>
             </w:tcBorders>
             <w:vAlign w:val="center"/>
           </w:tcPr>
@@ -800,12 +800,12 @@
         <w:tc>
           <w:tcPr>
             <w:tcBorders>
-              <w:top w:val="single" w:color="000000" w:sz="32"/>
-              <w:left w:val="single" w:color="000000" w:sz="32"/>
-              <w:bottom w:val="single" w:color="000000" w:sz="32"/>
-              <w:right w:val="single" w:color="000000" w:sz="32"/>
-              <w:insideH w:val="single" w:color="000000" w:sz="32"/>
-              <w:insideV w:val="single" w:color="000000" w:sz="32"/>
+              <w:top w:val="single" w:color="000000" w:sz="6"/>
+              <w:left w:val="single" w:color="000000" w:sz="6"/>
+              <w:bottom w:val="single" w:color="000000" w:sz="6"/>
+              <w:right w:val="single" w:color="000000" w:sz="6"/>
+              <w:insideH w:val="single" w:color="000000" w:sz="6"/>
+              <w:insideV w:val="single" w:color="000000" w:sz="6"/>
             </w:tcBorders>
             <w:vAlign w:val="center"/>
           </w:tcPr>
@@ -829,12 +829,12 @@
         <w:tc>
           <w:tcPr>
             <w:tcBorders>
-              <w:top w:val="single" w:color="000000" w:sz="32"/>
-              <w:left w:val="single" w:color="000000" w:sz="32"/>
-              <w:bottom w:val="single" w:color="000000" w:sz="32"/>
-              <w:right w:val="single" w:color="000000" w:sz="32"/>
-              <w:insideH w:val="single" w:color="000000" w:sz="32"/>
-              <w:insideV w:val="single" w:color="000000" w:sz="32"/>
+              <w:top w:val="single" w:color="000000" w:sz="6"/>
+              <w:left w:val="single" w:color="000000" w:sz="6"/>
+              <w:bottom w:val="single" w:color="000000" w:sz="6"/>
+              <w:right w:val="single" w:color="000000" w:sz="6"/>
+              <w:insideH w:val="single" w:color="000000" w:sz="6"/>
+              <w:insideV w:val="single" w:color="000000" w:sz="6"/>
             </w:tcBorders>
             <w:vAlign w:val="center"/>
           </w:tcPr>
@@ -863,12 +863,12 @@
         <w:tc>
           <w:tcPr>
             <w:tcBorders>
-              <w:top w:val="single" w:color="000000" w:sz="32"/>
-              <w:left w:val="single" w:color="000000" w:sz="32"/>
-              <w:bottom w:val="single" w:color="000000" w:sz="32"/>
-              <w:right w:val="single" w:color="000000" w:sz="32"/>
-              <w:insideH w:val="single" w:color="000000" w:sz="32"/>
-              <w:insideV w:val="single" w:color="000000" w:sz="32"/>
+              <w:top w:val="single" w:color="000000" w:sz="6"/>
+              <w:left w:val="single" w:color="000000" w:sz="6"/>
+              <w:bottom w:val="single" w:color="000000" w:sz="6"/>
+              <w:right w:val="single" w:color="000000" w:sz="6"/>
+              <w:insideH w:val="single" w:color="000000" w:sz="6"/>
+              <w:insideV w:val="single" w:color="000000" w:sz="6"/>
             </w:tcBorders>
             <w:vAlign w:val="center"/>
           </w:tcPr>
@@ -892,12 +892,12 @@
         <w:tc>
           <w:tcPr>
             <w:tcBorders>
-              <w:top w:val="single" w:color="000000" w:sz="32"/>
-              <w:left w:val="single" w:color="000000" w:sz="32"/>
-              <w:bottom w:val="single" w:color="000000" w:sz="32"/>
-              <w:right w:val="single" w:color="000000" w:sz="32"/>
-              <w:insideH w:val="single" w:color="000000" w:sz="32"/>
-              <w:insideV w:val="single" w:color="000000" w:sz="32"/>
+              <w:top w:val="single" w:color="000000" w:sz="6"/>
+              <w:left w:val="single" w:color="000000" w:sz="6"/>
+              <w:bottom w:val="single" w:color="000000" w:sz="6"/>
+              <w:right w:val="single" w:color="000000" w:sz="6"/>
+              <w:insideH w:val="single" w:color="000000" w:sz="6"/>
+              <w:insideV w:val="single" w:color="000000" w:sz="6"/>
             </w:tcBorders>
             <w:vAlign w:val="center"/>
           </w:tcPr>
@@ -921,12 +921,12 @@
         <w:tc>
           <w:tcPr>
             <w:tcBorders>
-              <w:top w:val="single" w:color="000000" w:sz="32"/>
-              <w:left w:val="single" w:color="000000" w:sz="32"/>
-              <w:bottom w:val="single" w:color="000000" w:sz="32"/>
-              <w:right w:val="single" w:color="000000" w:sz="32"/>
-              <w:insideH w:val="single" w:color="000000" w:sz="32"/>
-              <w:insideV w:val="single" w:color="000000" w:sz="32"/>
+              <w:top w:val="single" w:color="000000" w:sz="6"/>
+              <w:left w:val="single" w:color="000000" w:sz="6"/>
+              <w:bottom w:val="single" w:color="000000" w:sz="6"/>
+              <w:right w:val="single" w:color="000000" w:sz="6"/>
+              <w:insideH w:val="single" w:color="000000" w:sz="6"/>
+              <w:insideV w:val="single" w:color="000000" w:sz="6"/>
             </w:tcBorders>
             <w:vAlign w:val="center"/>
           </w:tcPr>
@@ -950,12 +950,12 @@
         <w:tc>
           <w:tcPr>
             <w:tcBorders>
-              <w:top w:val="single" w:color="000000" w:sz="32"/>
-              <w:left w:val="single" w:color="000000" w:sz="32"/>
-              <w:bottom w:val="single" w:color="000000" w:sz="32"/>
-              <w:right w:val="single" w:color="000000" w:sz="32"/>
-              <w:insideH w:val="single" w:color="000000" w:sz="32"/>
-              <w:insideV w:val="single" w:color="000000" w:sz="32"/>
+              <w:top w:val="single" w:color="000000" w:sz="6"/>
+              <w:left w:val="single" w:color="000000" w:sz="6"/>
+              <w:bottom w:val="single" w:color="000000" w:sz="6"/>
+              <w:right w:val="single" w:color="000000" w:sz="6"/>
+              <w:insideH w:val="single" w:color="000000" w:sz="6"/>
+              <w:insideV w:val="single" w:color="000000" w:sz="6"/>
             </w:tcBorders>
             <w:vAlign w:val="center"/>
           </w:tcPr>
@@ -984,12 +984,12 @@
         <w:tc>
           <w:tcPr>
             <w:tcBorders>
-              <w:top w:val="single" w:color="000000" w:sz="32"/>
-              <w:left w:val="single" w:color="000000" w:sz="32"/>
-              <w:bottom w:val="single" w:color="000000" w:sz="32"/>
-              <w:right w:val="single" w:color="000000" w:sz="32"/>
-              <w:insideH w:val="single" w:color="000000" w:sz="32"/>
-              <w:insideV w:val="single" w:color="000000" w:sz="32"/>
+              <w:top w:val="single" w:color="000000" w:sz="6"/>
+              <w:left w:val="single" w:color="000000" w:sz="6"/>
+              <w:bottom w:val="single" w:color="000000" w:sz="6"/>
+              <w:right w:val="single" w:color="000000" w:sz="6"/>
+              <w:insideH w:val="single" w:color="000000" w:sz="6"/>
+              <w:insideV w:val="single" w:color="000000" w:sz="6"/>
             </w:tcBorders>
             <w:vAlign w:val="center"/>
           </w:tcPr>
@@ -1013,12 +1013,12 @@
         <w:tc>
           <w:tcPr>
             <w:tcBorders>
-              <w:top w:val="single" w:color="000000" w:sz="32"/>
-              <w:left w:val="single" w:color="000000" w:sz="32"/>
-              <w:bottom w:val="single" w:color="000000" w:sz="32"/>
-              <w:right w:val="single" w:color="000000" w:sz="32"/>
-              <w:insideH w:val="single" w:color="000000" w:sz="32"/>
-              <w:insideV w:val="single" w:color="000000" w:sz="32"/>
+              <w:top w:val="single" w:color="000000" w:sz="6"/>
+              <w:left w:val="single" w:color="000000" w:sz="6"/>
+              <w:bottom w:val="single" w:color="000000" w:sz="6"/>
+              <w:right w:val="single" w:color="000000" w:sz="6"/>
+              <w:insideH w:val="single" w:color="000000" w:sz="6"/>
+              <w:insideV w:val="single" w:color="000000" w:sz="6"/>
             </w:tcBorders>
             <w:vAlign w:val="center"/>
           </w:tcPr>
@@ -1042,12 +1042,12 @@
         <w:tc>
           <w:tcPr>
             <w:tcBorders>
-              <w:top w:val="single" w:color="000000" w:sz="32"/>
-              <w:left w:val="single" w:color="000000" w:sz="32"/>
-              <w:bottom w:val="single" w:color="000000" w:sz="32"/>
-              <w:right w:val="single" w:color="000000" w:sz="32"/>
-              <w:insideH w:val="single" w:color="000000" w:sz="32"/>
-              <w:insideV w:val="single" w:color="000000" w:sz="32"/>
+              <w:top w:val="single" w:color="000000" w:sz="6"/>
+              <w:left w:val="single" w:color="000000" w:sz="6"/>
+              <w:bottom w:val="single" w:color="000000" w:sz="6"/>
+              <w:right w:val="single" w:color="000000" w:sz="6"/>
+              <w:insideH w:val="single" w:color="000000" w:sz="6"/>
+              <w:insideV w:val="single" w:color="000000" w:sz="6"/>
             </w:tcBorders>
             <w:vAlign w:val="center"/>
           </w:tcPr>
@@ -1071,12 +1071,12 @@
         <w:tc>
           <w:tcPr>
             <w:tcBorders>
-              <w:top w:val="single" w:color="000000" w:sz="32"/>
-              <w:left w:val="single" w:color="000000" w:sz="32"/>
-              <w:bottom w:val="single" w:color="000000" w:sz="32"/>
-              <w:right w:val="single" w:color="000000" w:sz="32"/>
-              <w:insideH w:val="single" w:color="000000" w:sz="32"/>
-              <w:insideV w:val="single" w:color="000000" w:sz="32"/>
+              <w:top w:val="single" w:color="000000" w:sz="6"/>
+              <w:left w:val="single" w:color="000000" w:sz="6"/>
+              <w:bottom w:val="single" w:color="000000" w:sz="6"/>
+              <w:right w:val="single" w:color="000000" w:sz="6"/>
+              <w:insideH w:val="single" w:color="000000" w:sz="6"/>
+              <w:insideV w:val="single" w:color="000000" w:sz="6"/>
             </w:tcBorders>
             <w:vAlign w:val="center"/>
           </w:tcPr>

</xml_diff>